<commit_message>
Re-sync promo_doc: reconciled v11 (Will's through-Ex3 edits + TOFC mechanism rewrite + verbatim guideline swaps + Readiness fix), pushed to SharePoint
</commit_message>
<xml_diff>
--- a/promo_doc/zhouzw_promo_doc_v11_2026-07-27.docx
+++ b/promo_doc/zhouzw_promo_doc_v11_2026-07-27.docx
@@ -39,7 +39,7 @@
         <w:rPr>
           <w:i/>
         </w:rPr>
-        <w:t>Scope is subject to change with the pending re-org to CIRS.</w:t>
+        <w:t>Scope is subject to change with the re-org to CIRS.</w:t>
       </w:r>
     </w:p>
     <w:p>
@@ -155,7 +155,7 @@
         <w:rPr>
           <w:i/>
         </w:rPr>
-        <w:t>Role guideline: "You work with partner teams to understand their needs and reach consensus on approach in order to deliver to meet business goals."</w:t>
+        <w:t>Role guideline: "You collaborate with stakeholders to deliver high-quality consistent results."</w:t>
       </w:r>
     </w:p>
     <w:p>
@@ -230,7 +230,7 @@
         <w:rPr>
           <w:i/>
         </w:rPr>
-        <w:t>Role guideline: "You identify priorities and know when a situation requires a deep dive vs. issues that can be solved quickly."</w:t>
+        <w:t>Role guideline: "Even though this is not a tech role, it is one where you heavily leverage, influence, and guide the development of technology … to drive more optimal and more automated decision making, design, and execution."</w:t>
       </w:r>
     </w:p>
     <w:p>
@@ -238,7 +238,7 @@
         <w:rPr>
           <w:b/>
         </w:rPr>
-        <w:t>Example 3: Low-Cost Redirect Levers — Midstream Intermodal Reroute &amp; Origin-Side Flip</w:t>
+        <w:t>Example 3: Low-Cost Redirect Levers — Midstream Intermodal Reroutes &amp; Origin Flips</w:t>
       </w:r>
     </w:p>
     <w:p>
@@ -246,10 +246,10 @@
         <w:rPr>
           <w:b/>
         </w:rPr>
-        <w:t>When a mid-2026 Finance/ATS trailer-cap directive tightened the redirect-eligibility distance gate (1,000 → 750 miles) and cut redirect volume ~12%, William built a portfolio of lower-cost levers that recover the freight at only incremental cost — and drove the hourly execution team to adopt a midstream / low-cost-first mindset over the path of least resistance.</w:t>
+        <w:t>William built a portfolio of levers that redirect freight at much lower incremental cost — and when a mid-2026 ATS trailer-cap directive cut redirect volume ~12%, drove the hourly execution team to adopt a midstream / low-cost-first mindset over the path of least resistance.</w:t>
       </w:r>
       <w:r>
-        <w:t xml:space="preserve"> Redirect execution had defaulted to a single mechanism — a full downstream re-move once freight reached a stressed node. William wrote each cheaper lever's eligibility rules as standard work and led the change management to make them stick: presenting the levers in team and all-hands forums, and partnering with Area Managers to cross-train associates so midstream redirects became a feasible daily lever rather than a specialist's exception.</w:t>
+        <w:t xml:space="preserve"> Redirect execution has historically defaulted to a single mechanism — a full downstream re-move once freight reaches a stressed node. William wrote each cheaper lever's eligibility rules as standard work and led the change management to make them stick: presenting the levers in team and all-hands forums, and partnering with AA Managers to cross-train associates so midstream redirects became a feasible daily lever rather than a special exception.</w:t>
       </w:r>
     </w:p>
     <w:p>
@@ -272,7 +272,7 @@
         <w:t>while still on the rail leg</w:t>
       </w:r>
       <w:r>
-        <w:t xml:space="preserve"> — Amazon pays only the dray difference, avoiding the full over-the-road re-move. Working from AZIM's criteria, he built the tooling that flags which in-transit loads are still divertible. Since its WK24 launch the lever has redirected </w:t>
+        <w:t xml:space="preserve"> — Amazon pays only the dray difference, avoiding the cost of a full over-the-road redirect. Working from AZIM's criteria, he built the tooling that flags which in-transit loads are still divertible. Since its WK24 launch the lever has redirected </w:t>
       </w:r>
       <w:r>
         <w:rPr>
@@ -287,10 +287,10 @@
         <w:rPr>
           <w:b/>
         </w:rPr>
-        <w:t>~$150K in net transport avoidance to date — pacing to ~$930K by year-end (seasonally adjusted for the measured Q4 redirect surge) and a ~$1.3M full-year run-rate</w:t>
+        <w:t>~$150K in net transport avoidance to date — pacing to ~$930K by year-end (seasonally adjusted for the measured annual Q4 redirect surge) and a ~$1.3M full-year run-rate</w:t>
       </w:r>
       <w:r>
-        <w:t xml:space="preserve"> — priced load-by-load against carrier settlement actuals.¹ Crosstown interceptions — catching the load before its rail-carrier interchange to avoid an entire rail leg — have executed on two distinct hub/carrier pairs; the principle carries to 3P intermodal (HJBI / PGLI) redirects.</w:t>
+        <w:t xml:space="preserve"> — priced load-by-load against carrier settlement actuals.¹</w:t>
       </w:r>
     </w:p>
     <w:p>
@@ -301,10 +301,19 @@
         <w:rPr>
           <w:b/>
         </w:rPr>
-        <w:t>OB NTI origin-side flip (pre-dispatch).</w:t>
+        <w:t>nIXD OB NTI origin-side flip (pre-outbound into rIXD).</w:t>
       </w:r>
       <w:r>
-        <w:t xml:space="preserve"> William drove the outbound New-Transfer-In flip — redirecting transfer freight at the origin before a truck ever dispatches — from an inconsistent break-glass action into a documented standard lever, its mechanics and eligibility agreed with Reactive Scheduling and Amazon Transportation Services (ATS).</w:t>
+        <w:t xml:space="preserve"> William drove the outbound New-Transfer-In flip — redirecting transfer freight at the </w:t>
+      </w:r>
+      <w:r>
+        <w:rPr>
+          <w:i/>
+        </w:rPr>
+        <w:t>origin</w:t>
+      </w:r>
+      <w:r>
+        <w:t xml:space="preserve"> before a truck dispatches (nIXD → rIXD FC2) — from an inconsistent break-glass action into a documented standard lever, its mechanics and eligibility agreed with Reactive Scheduling and Amazon Transportation Services (ATS).</w:t>
       </w:r>
     </w:p>
     <w:p>
@@ -318,16 +327,7 @@
         <w:t>TOFC over OTR.</w:t>
       </w:r>
       <w:r>
-        <w:t xml:space="preserve"> Across two escalations William priced Trailer-on-Flatcar against the over-the-road status quo (</w:t>
-      </w:r>
-      <w:r>
-        <w:rPr>
-          <w:b/>
-        </w:rPr>
-        <w:t>~$4K/trailer saved direct-bypass, $2.3K/trailer as executed</w:t>
-      </w:r>
-      <w:r>
-        <w:t xml:space="preserve">); the Q2 LAS1 program adopted it and moved </w:t>
+        <w:t xml:space="preserve"> When LAS1's NVF delays exceeded 10 days with conventional levers exhausted, William built the Trailer-on-Flatcar execution mechanism itself — designing the three-step flow the team runs (ICT stages redirectable trailers on a shared tracker; AZIM builds the per-leg rail run structures; ICT attaches trailers and flips final-leg manifests) and running the daily execution cadence across AZIM, ATS, and a dedicated dray carrier. The Q2 program moved </w:t>
       </w:r>
       <w:r>
         <w:rPr>
@@ -336,12 +336,12 @@
         <w:t>146 trailers / 2.6M units for ~$336K in realized cost avoidance</w:t>
       </w:r>
       <w:r>
-        <w:t xml:space="preserve"> before the lever was deliberately parked to hold the line on linehaul-reduction spend.</w:t>
+        <w:t xml:space="preserve"> (priced against the over-the-road status quo: ~$4K/trailer direct-bypass, $2.3K/trailer as executed) before the lever was deliberately parked to hold the line on linehaul-reduction spend.</w:t>
       </w:r>
     </w:p>
     <w:p>
       <w:r>
-        <w:t>Upcoming work extends the playbook to Amazon Freight External (AFE) freight, partnering with GL and AF Finance to build a mechanism to reroute AFE appointments midstream — further reducing cost by avoiding the more expensive downstream Y2Y solution.</w:t>
+        <w:t>Upcoming work extends the playbook to Amazon Freight External (AFE) freight, partnering with GL and AF Finance to build a mechanism to reroute AFE appointments midstream — further reducing cost by avoiding the more expensive downstream solution.</w:t>
       </w:r>
     </w:p>
     <w:p>
@@ -349,7 +349,7 @@
         <w:rPr>
           <w:i/>
         </w:rPr>
-        <w:t>¹ Cost-avoidance figures are priced load-by-load against carrier settlement actuals, not modeled rates. The AZIM year-end pace applies the lever's demonstrated capture rate to the seasonally-expected redirect volume for the remaining weeks (trailing-18-month steering-tracker demand curve; Q4 runs ~2× the mid-year baseline), with the full-year run-rate stating the capability's value across a full seasonal cycle. Full per-lever methodology and basis in a backing appendix, available on request.</w:t>
+        <w:t>¹ Cost-avoidance figures are priced load-by-load against carrier settlement actuals; forward figures are extrapolations from that measured base. The AZIM year-end pace applies the lever's demonstrated capture rate to the seasonally-expected redirect volume for the remaining weeks (trailing-18-month demand curve; Q4 runs ~2× the mid-year baseline), with the full-year run-rate stating the capability's value across a full annual cycle. Full per-lever methodology and basis in a backing appendix, available on request.</w:t>
       </w:r>
     </w:p>
     <w:p>
@@ -368,7 +368,7 @@
         <w:rPr>
           <w:i/>
         </w:rPr>
-        <w:t>Role guideline: "You effectively manage difficult problems, mitigate immediate risks, and decide when you can handle or need to escalate."</w:t>
+        <w:t>Role guideline: "You are able to make trade-offs (deciding in how to optimize use on an internal network …)."</w:t>
       </w:r>
     </w:p>
     <w:p>
@@ -406,7 +406,7 @@
         <w:rPr>
           <w:i/>
         </w:rPr>
-        <w:t>Role guideline: "You work with partner teams to understand their needs and reach consensus on approach in order to deliver to meet business goals."</w:t>
+        <w:t>Role guideline: "You improve scope and depth of the measurement systems and make sure that the processes are auditable, decisions are data-driven, and work quality is measurable."</w:t>
       </w:r>
     </w:p>
     <w:p>
@@ -507,13 +507,13 @@
     </w:p>
     <w:p>
       <w:r>
-        <w:t xml:space="preserve">William's record meets each of the three "Moving to L5" criteria in the Supply Chain Manager Role Guideline: </w:t>
+        <w:t xml:space="preserve">William's record meets the "Moving to L5" criteria in the Supply Chain Manager Role Guideline: </w:t>
       </w:r>
       <w:r>
         <w:rPr>
           <w:b/>
         </w:rPr>
-        <w:t>effectively managing difficult problems and deciding when to handle or escalate</w:t>
+        <w:t>creating and delivering short-term solutions with limited guidance and determining when he can handle or needs to escalate</w:t>
       </w:r>
       <w:r>
         <w:t xml:space="preserve"> (Example 3) — including declining redirects the backlog data does not warrant tying up AZNG resources for, holding that position with data even when the ask comes from senior stakeholders; </w:t>
@@ -522,19 +522,19 @@
         <w:rPr>
           <w:b/>
         </w:rPr>
-        <w:t>identifying priorities and knowing when a situation requires a deep dive vs. a quick solve</w:t>
+        <w:t>asking the right questions and providing recommendations to identify risk and foster shared understanding</w:t>
       </w:r>
       <w:r>
-        <w:t xml:space="preserve"> (Example 2); and </w:t>
+        <w:t xml:space="preserve"> (Examples 2 and 4); and </w:t>
       </w:r>
       <w:r>
         <w:rPr>
           <w:b/>
         </w:rPr>
-        <w:t>working with partner teams to reach consensus on approaches that meet business goals</w:t>
+        <w:t>collaborating with stakeholders to deliver high-quality consistent results, liaising between cross-functional teams as a primary escalation point</w:t>
       </w:r>
       <w:r>
-        <w:t xml:space="preserve"> (Examples 1, 4, and 5).</w:t>
+        <w:t xml:space="preserve"> (Examples 1 and 5).</w:t>
       </w:r>
     </w:p>
     <w:p>
@@ -594,7 +594,7 @@
         <w:t>Multi-network strategic levers.</w:t>
       </w:r>
       <w:r>
-        <w:t xml:space="preserve"> Example 3's lever portfolio is the template. </w:t>
+        <w:t xml:space="preserve"> </w:t>
       </w:r>
       <w:r>
         <w:rPr>

</xml_diff>